<commit_message>
fix(layout): set a column height and fill against it, the way Word does
Co-Authored-By: Claude Opus 5 <noreply@anthropic.com>
Signed-off-by: RyujiYasukochi <ryuji.yasu@gmail.com>
</commit_message>
<xml_diff>
--- a/tests/fixtures/column_split/col_10lines_last20hp_compat15.docx
+++ b/tests/fixtures/column_split/col_10lines_last20hp_compat15.docx
@@ -172,6 +172,22 @@
         </w:sectPr>
       </w:pPr>
     </w:p>
+    <w:p>
+      <w:pPr>
+        <w:spacing w:before="0" w:after="0" w:line="240" w:lineRule="auto"/>
+        <w:rPr>
+          <w:rFonts w:ascii="Arial" w:hAnsi="Arial"/>
+          <w:sz w:val="20"/>
+        </w:rPr>
+      </w:pPr>
+      <w:r>
+        <w:rPr>
+          <w:rFonts w:ascii="Arial" w:hAnsi="Arial"/>
+          <w:sz w:val="20"/>
+        </w:rPr>
+        <w:t xml:space="preserve">after</w:t>
+      </w:r>
+    </w:p>
     <w:sectPr>
       <w:type w:val="continuous"/>
       <w:cols w:num="1" w:space="360"/>

</xml_diff>